<commit_message>
Add SIROCCO schematic image to client DOCX
</commit_message>
<xml_diff>
--- a/outputs/b1528_sirocco/current_heading_rudder_30deg_limit/b1528_sirocco_current_heading_rudder_30deg_limit_client_review.docx
+++ b/outputs/b1528_sirocco/current_heading_rudder_30deg_limit/b1528_sirocco_current_heading_rudder_30deg_limit_client_review.docx
@@ -32,8 +32,9 @@
       <w:pPr>
         <w:pStyle w:val="IntenseQuote"/>
       </w:pPr>
+      <w:r/>
       <w:r>
-        <w:t>Native Word version: this DOCX was rebuilt with editable Word paragraphs and tables. It is not a PDF page-image conversion; chart data are included as editable tabular slices, and the four interactive report charts are embedded below as review images.</w:t>
+        <w:t>Native Word version: this DOCX was rebuilt with editable Word paragraphs and tables. It is not a PDF page-image conversion; the schematic and chart data are included as editable tabular slices, and all HTML report visuals are embedded as static images for 1:1 review against the HTML output.</w:t>
       </w:r>
     </w:p>
     <w:p>
@@ -465,6 +466,55 @@
       </w:pPr>
       <w:r>
         <w:t>Ship/current/rudder geometry schematic — editable description</w:t>
+      </w:r>
+    </w:p>
+    <w:p>
+      <w:r>
+        <w:rPr>
+          <w:b/>
+        </w:rPr>
+        <w:t>Schematic image — ship/current/rudder geometry</w:t>
+      </w:r>
+    </w:p>
+    <w:p>
+      <w:r>
+        <w:t>Source: interactive HTML report schematic capture; adjacent editable bullets/table preserve the geometry convention and vector meanings.</w:t>
+      </w:r>
+    </w:p>
+    <w:p>
+      <w:r>
+        <w:drawing>
+          <wp:inline xmlns:a="http://schemas.openxmlformats.org/drawingml/2006/main" xmlns:pic="http://schemas.openxmlformats.org/drawingml/2006/picture">
+            <wp:extent cx="5943600" cy="3784274"/>
+            <wp:docPr id="5" name="Picture 5"/>
+            <wp:cNvGraphicFramePr>
+              <a:graphicFrameLocks noChangeAspect="1"/>
+            </wp:cNvGraphicFramePr>
+            <a:graphic>
+              <a:graphicData uri="http://schemas.openxmlformats.org/drawingml/2006/picture">
+                <pic:pic>
+                  <pic:nvPicPr>
+                    <pic:cNvPr id="0" name="sirocco_30deg_schematic.png"/>
+                    <pic:cNvPicPr/>
+                  </pic:nvPicPr>
+                  <pic:blipFill>
+                    <a:blip r:embed="rId13"/>
+                    <a:stretch>
+                      <a:fillRect/>
+                    </a:stretch>
+                  </pic:blipFill>
+                  <pic:spPr>
+                    <a:xfrm>
+                      <a:off x="0" y="0"/>
+                      <a:ext cx="5943600" cy="3784274"/>
+                    </a:xfrm>
+                    <a:prstGeom prst="rect"/>
+                  </pic:spPr>
+                </pic:pic>
+              </a:graphicData>
+            </a:graphic>
+          </wp:inline>
+        </w:drawing>
       </w:r>
     </w:p>
     <w:p>
@@ -8189,8 +8239,9 @@
       </w:r>
     </w:p>
     <w:p>
+      <w:r/>
       <w:r>
-        <w:t>Replacement note: native DOCX generated directly from HTML-embedded report data and static report text; chart images were captured from the interactive HTML report and embedded as PNG review figures.</w:t>
+        <w:t>Replacement note: native DOCX generated directly from HTML-embedded report data and static report text; the schematic and chart images were captured from the interactive HTML report and embedded as static review visuals, while adjacent Word tables preserve editable values.</w:t>
       </w:r>
     </w:p>
     <w:sectPr>

</xml_diff>